<commit_message>
Port original Dragon List interface and features to Java, excluding mind maps
</commit_message>
<xml_diff>
--- a/docs/Курсовая_Dragon_list_Смирнов.docx
+++ b/docs/Курсовая_Dragon_list_Смирнов.docx
@@ -5366,7 +5366,7 @@
         <w:jc w:val="both"/>
       </w:pPr>
       <w:r>
-        <w:t>Практический результат работы — веб-приложение Dragon list для ведения личных заметок с предустановленными метками. Исходный код и инструкция запуска входят в состав проекта.</w:t>
+        <w:t>Практический результат работы — веб-приложение Dragon List с сервером на Java и интерфейсом для личных заметок. Приложение поддерживает Markdown, задачи, теги, черновики и корзину. Исходный код и инструкция запуска входят в состав проекта.</w:t>
       </w:r>
     </w:p>
     <w:p>
@@ -5398,7 +5398,7 @@
         <w:jc w:val="both"/>
       </w:pPr>
       <w:r>
-        <w:t>Объект исследования — организация хранения личных записей в веб-приложении. Предмет исследования — средства Java для регистрации пользователей, управления заметками и фильтрации записей по метке. Цель работы — разработать приложение Dragon list, в котором каждый пользователь работает только со своими заметками.</w:t>
+        <w:t>Объект исследования — организация хранения личных записей в веб-приложении. Предмет исследования — средства Java для авторизации, управления заметками и ограничения доступа к данным. Цель работы — разработать Dragon List, в котором каждый пользователь работает только со своими заметками, задачами и тегами.</w:t>
       </w:r>
     </w:p>
     <w:p>
@@ -5407,7 +5407,7 @@
         <w:jc w:val="both"/>
       </w:pPr>
       <w:r>
-        <w:t>Для достижения цели необходимо определить структуру страниц и базы данных, выбрать совместимые библиотеки, реализовать регистрацию и вход, операции создания, просмотра, редактирования и удаления заметок, а также фильтрацию. Отдельная задача — проверить ограничения доступа и подготовить приложение к развёртыванию на VPS с Debian 11.</w:t>
+        <w:t>Для достижения цели необходимо определить структуру интерфейса и базы данных, выбрать совместимые библиотеки, реализовать регистрацию, вход, операции CRUD и фильтрацию. Дополнительные задачи — автосохранение, Markdown, списки задач, черновики, корзина, настройки профиля и подготовка к запуску на Debian 11. Интеллект-карты в состав проекта не входят.</w:t>
       </w:r>
     </w:p>
     <w:p>
@@ -5452,7 +5452,7 @@
         <w:jc w:val="both"/>
       </w:pPr>
       <w:r>
-        <w:t>Интерфейс формируется на сервере с помощью Thymeleaf и обычного CSS. Такой подход позволяет реализовать пять требуемых страниц без отдельного клиентского приложения. Основное внимание уделено серверной логике. В оформление включены изображения драконов из предыдущего проекта; мобильная версия не разрабатывалась.</w:t>
+        <w:t>Интерфейс перенесён из предыдущего проекта Dragon List и использует React, HTML, CSS и JavaScript. В браузере размещены боковая панель, список и редактор; доступны светлая и тёмная темы. Серверная логика полностью реализована на Java. Thymeleaf формирует страницы входа и регистрации, а готовая браузерная сборка включена в JAR: Node.js на VPS не нужен.</w:t>
       </w:r>
     </w:p>
     <w:p>
@@ -5475,7 +5475,7 @@
         <w:jc w:val="both"/>
       </w:pPr>
       <w:r>
-        <w:t>Приложение разделено на контроллер, сервис, репозитории и модели данных. WebController принимает HTTP-запросы и возвращает HTML-страницы. NoteService проверяет владельца заметки и выполняет изменения в транзакции. UserRepository и NoteRepository предоставляют операции доступа к данным. Классы User и Note описывают сущности, RegistrationForm и NoteForm — данные входящих форм.</w:t>
+        <w:t>Приложение разделено на контроллеры, сервисы и слой доступа к данным. WebController отвечает за страницы и формы регистрации. WorkspaceApi принимает JSON-запросы редактора, WorkspaceService проверяет владельца и выполняет изменения в транзакциях. Spring Data JPA используется для пользователей и учебных форм заметок, JdbcTemplate — для расширенных операций рабочего пространства.</w:t>
       </w:r>
     </w:p>
     <w:p>
@@ -5484,7 +5484,7 @@
         <w:jc w:val="both"/>
       </w:pPr>
       <w:r>
-        <w:t>Spring MVC связывает параметры запроса с объектами форм. Bean Validation проверяет обязательность и длину полей. Spring Data JPA использует Hibernate для преобразования сущностей в строки таблиц. Flyway выполняет версионированную SQL-миграцию V1__schema.sql, а Hibernate при запуске проверяет соответствие схемы моделям. Создание схемы и её проверка разделены, что делает изменения базы данных воспроизводимыми.</w:t>
+        <w:t>Spring MVC обрабатывает запросы и связывает поля форм с объектами. Bean Validation проверяет формы, а сервис расширенного API дополнительно проверяет типы, длины и допустимые значения JSON. JdbcTemplate выполняет параметризованные SQL-запросы. Flyway применяет миграции V1 и V2, Hibernate проверяет совместимость сущностей со схемой. V2 расширяет базу без удаления существующих записей.</w:t>
       </w:r>
     </w:p>
     <w:p>
@@ -5502,7 +5502,7 @@
         <w:jc w:val="both"/>
       </w:pPr>
       <w:r>
-        <w:t>Таблица notes содержит id, user_id, title, content, tag и created_at. Поле user_id является внешним ключом на users.id: одному пользователю соответствует несколько заметок. Заголовок ограничен 200 символами, текст — 20000 символами на уровне формы. Метка обязательна и принимает только IMPORTANT, IDEAS, STUDY или PERSONAL. Пользователь видит названия «Важное», «Идеи», «Учеба», «Личное». Ограничение CHECK закрепляет список меток в базе.</w:t>
+        <w:t>Таблица notes сохраняет основные поля задания: id, user_id, title, content, tag и created_at. Миграция V2 добавляет статус active, draft или trashed, тип note или todo, позицию, закрепление, дату изменения и удаления. Дополнительные таблицы user_tags и note_tags связывают заметки с тегами; todos хранит задачи, profiles — настройки, media — проверенные изображения.</w:t>
       </w:r>
     </w:p>
     <w:p>
@@ -5511,7 +5511,7 @@
         <w:jc w:val="both"/>
       </w:pPr>
       <w:r>
-        <w:t>Дата создания хранится как Instant и не изменяется при редактировании. В интерфейсе она отображается по московскому времени. Индексы по владельцу и дате, а также по владельцу, метке и дате соответствуют основным запросам списка. Для VPS предусмотрен PostgreSQL, для локального запуска и автоматических тестов — H2 в режиме совместимости с PostgreSQL.</w:t>
+        <w:t>Дата создания сохраняется при редактировании, дата изменения обновляется отдельно. Индексы ускоряют выборку по владельцу и статусу. Для каждого пользователя создаются четыре исходные метки: Важное, Идеи, Учеба, Личное. Расширенная версия позволяет добавлять свои теги, менять цвет и назначать несколько тегов заметке. Для VPS предусмотрен PostgreSQL, для локального запуска и тестов — H2 в режиме совместимости с PostgreSQL.</w:t>
       </w:r>
     </w:p>
     <w:p>
@@ -5520,7 +5520,7 @@
         <w:jc w:val="both"/>
       </w:pPr>
       <w:r>
-        <w:t>Spring Security выполняет аутентификацию и хранит её результат в серверной сессии. Пароль при регистрации хешируется BCrypt; исходное значение в базу не записывается. Все операции изменения защищены CSRF-токеном. Выборка конкретной заметки выполняется методом findByIdAndUserLogin, поэтому изменение адреса в браузере не даёт доступа к записи другого пользователя. В этом случае возвращается код 404.</w:t>
+        <w:t>Spring Security выполняет аутентификацию и хранит её результат в серверной сессии. Пароли хешируются BCrypt. Все изменения защищены CSRF-токеном. Каждый запрос заметки, задачи, тега и изображения ограничивается владельцем из сессии; чужая запись возвращает 404. Markdown отображается без исполнения исходного HTML. Загруженные изображения проверяются по формату, размеру и разрешению и перекодируются сервером.</w:t>
       </w:r>
     </w:p>
     <w:p>
@@ -5543,7 +5543,7 @@
         <w:jc w:val="both"/>
       </w:pPr>
       <w:r>
-        <w:t>Сначала создан Maven-проект и подключены web, thymeleaf, data-jpa, security, validation, Flyway и драйверы баз данных. Версии библиотек определяются родительским проектом Spring Boot. Затем подготовлены SQL-миграция, сущности и репозитории. После этого реализованы сервис заметок, настройки безопасности и контроллер страниц.</w:t>
+        <w:t>Сначала создан Maven-проект с зависимостями Spring Boot. Затем подготовлены сущности и первая миграция с таблицами users и notes. Для переноса функций предыдущего проекта добавлены миграция V2, WorkspaceService и REST-контроллер. После этого браузерные компоненты подключены к Java API, а формы входа и регистрации приведены к оформлению старого проекта.</w:t>
       </w:r>
     </w:p>
     <w:p>
@@ -5561,7 +5561,7 @@
         <w:jc w:val="both"/>
       </w:pPr>
       <w:r>
-        <w:t>После входа открывается таблица с заголовком, меткой и датой. GET /notes возвращает все заметки текущего пользователя, GET /notes?tag=STUDY — только записи с меткой «Учеба». Список упорядочен по дате создания и идентификатору по убыванию. Пустая выборка сопровождается пояснением.</w:t>
+        <w:t>После входа открывается рабочее пространство: навигация слева, список заметок и редактор. GET /api/notes/?status=active возвращает активные записи, параметры search и tag задают поиск и фильтр. Сортировка учитывает закрепление, позицию и дату изменения. Порядок списка меняется перетаскиванием; массовое действие применяется в транзакции, причём список с чужой записью отклоняется целиком.</w:t>
       </w:r>
     </w:p>
     <w:p>
@@ -5570,7 +5570,7 @@
         <w:jc w:val="both"/>
       </w:pPr>
       <w:r>
-        <w:t>Создание выполняется через GET /notes/new и POST /notes. Страница GET /notes/{id} показывает полный текст. Для изменения используются GET и POST /notes/{id}/edit, для удаления — POST /notes/{id}/delete с подтверждением. После успешного сохранения сервер перенаправляет браузер, что снижает риск повторной отправки формы при обновлении страницы. Отдельный JSON API не создавался: взаимодействие построено на HTML-формах и HTTP-маршрутах.</w:t>
+        <w:t>Создание выполняется POST /api/notes/, редактирование — PATCH /api/notes/{id}/. Редактор автоматически сохраняет изменения с небольшой задержкой, сериализует запросы к одной заметке и показывает состояние сохранения. При ошибке текст остаётся в очереди для повторной отправки. Markdown имеет панель форматирования и режим просмотра. Списки задач поддерживают добавление, переименование, отметку выполнения и удаление пунктов.</w:t>
       </w:r>
     </w:p>
     <w:p>
@@ -5579,7 +5579,7 @@
         <w:jc w:val="both"/>
       </w:pPr>
       <w:r>
-        <w:t>Право доступа проверяется при просмотре, открытии формы редактирования, сохранении и удалении. Идентификатор владельца не принимается из формы, а определяется из текущей аутентификации. Текст выводится через th:text, поэтому HTML-код заметки отображается как текст. Ссылка поддержки появляется только после заполнения переменной DONATION_URL действительной HTTPS-ссылкой.</w:t>
+        <w:t>DELETE /api/notes/{id}/ перемещает заметку в корзину; POST /api/notes/{id}/restore/ восстанавливает её. Окончательное удаление выполняется отдельным действием только для записи в корзине и подтверждается в интерфейсе. Черновики имеют отдельный раздел. Профиль позволяет изменить логин, email, описание, аватар и пароль. Ссылка поддержки перенесена из старого проекта без дополнительных рекламных подписей.</w:t>
       </w:r>
     </w:p>
     <w:p>
@@ -5588,7 +5588,7 @@
         <w:jc w:val="both"/>
       </w:pPr>
       <w:r>
-        <w:t>Автоматические проверки выполнены командой mvn verify. Три интеграционных теста охватывают регистрацию, вход, повторный логин, хеширование пароля, валидацию, CSRF, экранирование HTML, полный цикл CRUD, фильтр и неизменность даты. Отдельно проверены попытки просмотра, изменения и удаления чужой заметки. Итоговая сборка завершилась успешно. Дополнительно в браузере пройден сценарий регистрации, входа, создания, редактирования, удаления и выхода.</w:t>
+        <w:t>Командой mvn verify выполнены восемь интеграционных тестов. Они охватывают регистрацию, вход, хеширование, CSRF, CRUD и фильтрацию; расширенный API тегов, сортировки, массовых действий, задач, изображений, профиля и пароля. Отдельно проверяются обращения к чужим данным и отказ от неподдерживаемого типа заметки. Итоговая сборка JAR завершилась успешно.</w:t>
       </w:r>
     </w:p>
     <w:p>
@@ -5597,7 +5597,7 @@
         <w:jc w:val="both"/>
       </w:pPr>
       <w:r>
-        <w:t>Тесты использовали H2 и настоящую миграцию схемы. Подключение к PostgreSQL на реальном VPS в рамках локальной проверки не выполнялось. Поэтому перед эксплуатацией необходимо проверить переменные подключения и выполнить контрольный сценарий на целевом сервере.</w:t>
+        <w:t>В браузере проверены регистрация и вход, автосохранение с перезагрузкой, Markdown, теги, черновики, корзина, восстановление, задачи, сохранение темы и выход. Автоматические тесты используют H2 и обе миграции. На реальном VPS подключение к PostgreSQL пока не проверялось; перед эксплуатацией необходим контрольный запуск на целевом сервере.</w:t>
       </w:r>
     </w:p>
     <w:p>
@@ -5620,7 +5620,7 @@
         <w:jc w:val="both"/>
       </w:pPr>
       <w:r>
-        <w:t>На рисунке 1 показан список с созданной во время проверки заметкой. На рисунке 2 — её полный текст, метка и действия. Снимки получены из работающего приложения.</w:t>
+        <w:t>На рисунке 1 показано рабочее пространство с заметкой в режиме просмотра Markdown. На рисунке 2 — список задач. Снимки получены из работающего Java-приложения после переноса интерфейса.</w:t>
       </w:r>
     </w:p>
     <w:p>
@@ -5630,7 +5630,7 @@
       <w:r>
         <w:drawing>
           <wp:inline xmlns:a="http://schemas.openxmlformats.org/drawingml/2006/main" xmlns:pic="http://schemas.openxmlformats.org/drawingml/2006/picture">
-            <wp:extent cx="5400000" cy="2437500"/>
+            <wp:extent cx="4680000" cy="2049635"/>
             <wp:docPr id="1" name="Picture 1"/>
             <wp:cNvGraphicFramePr>
               <a:graphicFrameLocks noChangeAspect="1"/>
@@ -5639,7 +5639,7 @@
               <a:graphicData uri="http://schemas.openxmlformats.org/drawingml/2006/picture">
                 <pic:pic>
                   <pic:nvPicPr>
-                    <pic:cNvPr id="0" name="notes.png"/>
+                    <pic:cNvPr id="0" name="course-workspace.png"/>
                     <pic:cNvPicPr/>
                   </pic:nvPicPr>
                   <pic:blipFill>
@@ -5651,7 +5651,7 @@
                   <pic:spPr>
                     <a:xfrm>
                       <a:off x="0" y="0"/>
-                      <a:ext cx="5400000" cy="2437500"/>
+                      <a:ext cx="4680000" cy="2049635"/>
                     </a:xfrm>
                     <a:prstGeom prst="rect"/>
                   </pic:spPr>
@@ -5669,7 +5669,7 @@
         <w:jc w:val="center"/>
       </w:pPr>
       <w:r>
-        <w:t>Рисунок 1 — Список заметок</w:t>
+        <w:t>Рисунок 1 — Рабочее пространство</w:t>
       </w:r>
     </w:p>
     <w:p>
@@ -5679,7 +5679,7 @@
       <w:r>
         <w:drawing>
           <wp:inline xmlns:a="http://schemas.openxmlformats.org/drawingml/2006/main" xmlns:pic="http://schemas.openxmlformats.org/drawingml/2006/picture">
-            <wp:extent cx="5400000" cy="2437500"/>
+            <wp:extent cx="4680000" cy="1310400"/>
             <wp:docPr id="2" name="Picture 2"/>
             <wp:cNvGraphicFramePr>
               <a:graphicFrameLocks noChangeAspect="1"/>
@@ -5688,7 +5688,7 @@
               <a:graphicData uri="http://schemas.openxmlformats.org/drawingml/2006/picture">
                 <pic:pic>
                   <pic:nvPicPr>
-                    <pic:cNvPr id="0" name="note.png"/>
+                    <pic:cNvPr id="0" name="course-tasks.png"/>
                     <pic:cNvPicPr/>
                   </pic:nvPicPr>
                   <pic:blipFill>
@@ -5700,7 +5700,7 @@
                   <pic:spPr>
                     <a:xfrm>
                       <a:off x="0" y="0"/>
-                      <a:ext cx="5400000" cy="2437500"/>
+                      <a:ext cx="4680000" cy="1310400"/>
                     </a:xfrm>
                     <a:prstGeom prst="rect"/>
                   </pic:spPr>
@@ -5718,7 +5718,7 @@
         <w:jc w:val="center"/>
       </w:pPr>
       <w:r>
-        <w:t>Рисунок 2 — Просмотр заметки</w:t>
+        <w:t>Рисунок 2 — Список задач</w:t>
       </w:r>
     </w:p>
     <w:p>
@@ -5759,7 +5759,7 @@
         <w:jc w:val="both"/>
       </w:pPr>
       <w:r>
-        <w:t>Разработано веб-приложение Dragon list на Java, реализующее регистрацию и авторизацию, создание, просмотр, редактирование и удаление личных заметок. Для каждой заметки выбирается одна из четырёх предустановленных меток; список можно отфильтровать. Серверная проверка владельца ограничивает доступ к чужим записям.</w:t>
+        <w:t>Разработано приложение Dragon List с серверной частью на Java 17 и Spring Boot. Реализованы регистрация, авторизация и управление личными заметками, поиск и фильтры по тегам. Из предыдущего проекта перенесены интерфейс, Markdown, задачи, автосохранение, черновики, корзина и восстановление. Интеллект-карты исключены из согласованного состава функций.</w:t>
       </w:r>
     </w:p>
     <w:p>
@@ -5768,7 +5768,7 @@
         <w:jc w:val="both"/>
       </w:pPr>
       <w:r>
-        <w:t>В ходе работы выбраны и согласованы библиотеки, спроектированы две связанные таблицы, создана миграция базы данных и выполнены интеграционные проверки. Браузерная проверка подтвердила основной пользовательский сценарий. Практический результат включает исходный код, исполняемый JAR и инструкцию для Debian 11. Возможность развёртывания подготовлена конфигурацией; фактическая установка на VPS остаётся отдельным этапом.</w:t>
+        <w:t>В ходе работы выбраны библиотеки, спроектирована схема из семи связанных таблиц и созданы две миграции. Выполнены интеграционные тесты и браузерная проверка. Практический результат включает исходный код, JAR, подготовленные настройки systemd и nginx и инструкцию для Debian 11. Фактическая установка на VPS остаётся отдельным этапом.</w:t>
       </w:r>
     </w:p>
     <w:p>
@@ -5777,7 +5777,7 @@
         <w:jc w:val="both"/>
       </w:pPr>
       <w:r>
-        <w:t>Первая версия рассчитана на небольшой объём личных записей. В ней отсутствуют пагинация, восстановление пароля и ограничение частоты попыток входа. В дальнейшем целесообразно добавить эти возможности, а также отдельную проверку на целевой PostgreSQL. Основные требования задания реализованы, а ограничения первой версии отражены в документации.</w:t>
+        <w:t>Приложение рассчитано на небольшой объём личных записей. Список пока не имеет пагинации, отсутствуют восстановление забытого пароля и ограничение частоты входа. Регистрация открытая, как предусмотрено исходным заданием. Дальнейшее развитие включает эти возможности и проверку на целевой PostgreSQL. Основные функции реализованы, ограничения отражены в документации.</w:t>
       </w:r>
     </w:p>
     <w:p>

</xml_diff>

<commit_message>
Structure Java features and deploy isolated Dragon List with WAF and security tests
</commit_message>
<xml_diff>
--- a/docs/Курсовая_Dragon_list_Смирнов.docx
+++ b/docs/Курсовая_Dragon_list_Смирнов.docx
@@ -5475,7 +5475,7 @@
         <w:jc w:val="both"/>
       </w:pPr>
       <w:r>
-        <w:t>Приложение разделено на контроллеры, сервисы и слой доступа к данным. WebController отвечает за страницы и формы регистрации. WorkspaceApi принимает JSON-запросы редактора, WorkspaceService проверяет владельца и выполняет изменения в транзакциях. Spring Data JPA используется для пользователей и учебных форм заметок, JdbcTemplate — для расширенных операций рабочего пространства.</w:t>
+        <w:t>Приложение разделено по функциям: auth, notes, tags, tasks, profile и media. В каждом разделе контроллер принимает запрос, а сервис выполняет проверки и транзакции. Пакет security содержит настройку авторизации, ограничения запросов и отзыв сессий; common — общую валидацию. Spring Data JPA используется для пользователей, JdbcTemplate — для остальных операций. Дублирующие HTML-формы заметок удалены.</w:t>
       </w:r>
     </w:p>
     <w:p>
@@ -5484,7 +5484,7 @@
         <w:jc w:val="both"/>
       </w:pPr>
       <w:r>
-        <w:t>Spring MVC обрабатывает запросы и связывает поля форм с объектами. Bean Validation проверяет формы, а сервис расширенного API дополнительно проверяет типы, длины и допустимые значения JSON. JdbcTemplate выполняет параметризованные SQL-запросы. Flyway применяет миграции V1 и V2, Hibernate проверяет совместимость сущностей со схемой. V2 расширяет базу без удаления существующих записей.</w:t>
+        <w:t>Spring MVC обрабатывает запросы и связывает поля форм с объектами. Bean Validation проверяет формы, а сервис расширенного API дополнительно проверяет типы, длины и допустимые значения JSON. JdbcTemplate выполняет параметризованные SQL-запросы. Flyway применяет миграции V1, V2 и V3; в локальном профиле Hibernate проверяет совместимость сущностей со схемой. V2 расширяет базу без удаления существующих записей.</w:t>
       </w:r>
     </w:p>
     <w:p>
@@ -5543,7 +5543,7 @@
         <w:jc w:val="both"/>
       </w:pPr>
       <w:r>
-        <w:t>Сначала создан Maven-проект с зависимостями Spring Boot. Затем подготовлены сущности и первая миграция с таблицами users и notes. Для переноса функций предыдущего проекта добавлены миграция V2, WorkspaceService и REST-контроллер. После этого браузерные компоненты подключены к Java API, а формы входа и регистрации приведены к оформлению старого проекта.</w:t>
+        <w:t>Сначала создан Maven-проект с зависимостями Spring Boot и миграция с таблицами users и notes. Миграция V2 добавляет расширенные функции предыдущего проекта, V3 — версию сессий. Затем интерфейс подключён к Java API. При подготовке к эксплуатации код разделён по функциям, добавлены ограничения запросов и отдельный запуск миграций с расширенными правами БД.</w:t>
       </w:r>
     </w:p>
     <w:p>
@@ -5588,7 +5588,7 @@
         <w:jc w:val="both"/>
       </w:pPr>
       <w:r>
-        <w:t>Командой mvn verify выполнены восемь интеграционных тестов. Они охватывают регистрацию, вход, хеширование, CSRF, CRUD и фильтрацию; расширенный API тегов, сортировки, массовых действий, задач, изображений, профиля и пароля. Отдельно проверяются обращения к чужим данным и отказ от неподдерживаемого типа заметки. Итоговая сборка JAR завершилась успешно.</w:t>
+        <w:t>Выполнены 57 различных автоматизированных тестов: восемь Java-тестов, 41 HTTP-тест на Python и восемь серверных проверок. Они охватывают функции сайта, изоляцию данных, CSRF, смену пароля, файлы, блокировки WAF, права БД и контейнеров. Java-сборка завершилась успешно. HTTP-набор прошёл на PostgreSQL за WAF и повторно на публичном HTTPS-адресе.</w:t>
       </w:r>
     </w:p>
     <w:p>
@@ -5597,7 +5597,7 @@
         <w:jc w:val="both"/>
       </w:pPr>
       <w:r>
-        <w:t>В браузере проверены регистрация и вход, автосохранение с перезагрузкой, Markdown, теги, черновики, корзина, восстановление, задачи, сохранение темы и выход. Автоматические тесты используют H2 и обе миграции. На реальном VPS подключение к PostgreSQL пока не проверялось; перед эксплуатацией необходим контрольный запуск на целевом сервере.</w:t>
+        <w:t>В браузере проверены вход, автосохранение с перезагрузкой, Markdown, теги, черновики, корзина, задачи, темы и выход. SQL и HTML в заметке сохраняются как текст. Все три миграции проверены на H2 и PostgreSQL. Резервная копия PostgreSQL восстановлена в отдельную проверочную БД; состояние Amnezia до и после развёртывания не изменилось.</w:t>
       </w:r>
     </w:p>
     <w:p>
@@ -5736,7 +5736,7 @@
         <w:jc w:val="both"/>
       </w:pPr>
       <w:r>
-        <w:t>Для Debian 11 подготовлены unit-файл systemd, конфигурация nginx и пример переменных окружения. На сервере устанавливаются Java 17 и PostgreSQL, создаются отдельные пользователь и база. Включается профиль prod, задаются DB_URL, DB_USER и DB_PASSWORD. nginx передаёт запросы приложению на localhost. До входа необходимо настроить HTTPS: в профиле prod cookie сессии передаётся только по защищённому соединению. Полная последовательность команд приведена в README проекта.</w:t>
+        <w:t>Приложение развёрнуто на Debian 11 в отдельных контейнерах с Java 17, PostgreSQL 16 и Coraza с OWASP CRS. Существующий Caddy обслуживает HTTPS на dragon-list.lol и передаёт запросы через WAF. Порты Java и БД не публикуются. Рабочая роль БД не имеет права менять таблицы; миграции выполняются отдельной ролью. Настроены ежедневные копии. Старый контейнер остановлен, его данные сохранены для отката. Учебный план защиты хранится отдельно и в развёртывание не входит.</w:t>
       </w:r>
     </w:p>
     <w:p>
@@ -5768,7 +5768,7 @@
         <w:jc w:val="both"/>
       </w:pPr>
       <w:r>
-        <w:t>В ходе работы выбраны библиотеки, спроектирована схема из семи связанных таблиц и созданы две миграции. Выполнены интеграционные тесты и браузерная проверка. Практический результат включает исходный код, JAR, подготовленные настройки systemd и nginx и инструкцию для Debian 11. Фактическая установка на VPS остаётся отдельным этапом.</w:t>
+        <w:t>В ходе работы выбраны библиотеки, спроектированы семь связанных таблиц и созданы три миграции. Подготовлены тесты на Java и Python, выполнена браузерная проверка. Практический результат включает исходный код, JAR, контейнерные настройки, инструкцию обслуживания и отдельный план защиты. Приложение установлено на VPS; старое развёртывание сохранено.</w:t>
       </w:r>
     </w:p>
     <w:p>
@@ -5777,7 +5777,7 @@
         <w:jc w:val="both"/>
       </w:pPr>
       <w:r>
-        <w:t>Приложение рассчитано на небольшой объём личных записей. Список пока не имеет пагинации, отсутствуют восстановление забытого пароля и ограничение частоты входа. Регистрация открытая, как предусмотрено исходным заданием. Дальнейшее развитие включает эти возможности и проверку на целевой PostgreSQL. Основные функции реализованы, ограничения отражены в документации.</w:t>
+        <w:t>Приложение рассчитано на личные записи и имеет пагинацию, ограничения запросов и квоты данных. Пока отсутствуют восстановление забытого пароля и двухфакторный вход. Обычная LTS-поддержка Debian 11 завершилась 31 августа 2026 года. Дальнейшая работа — отдельный поддерживаемый VPS и внешние резервные копии: общий хост с VPN остаётся риском.</w:t>
       </w:r>
     </w:p>
     <w:p>
@@ -5822,7 +5822,7 @@
         <w:jc w:val="both"/>
       </w:pPr>
       <w:r>
-        <w:t>4. PostgreSQL. Documentation PostgreSQL 13. URL: https://www.postgresql.org/docs/13/ (дата обращения: 22.10.2026).</w:t>
+        <w:t>4. PostgreSQL. Documentation PostgreSQL 16. URL: https://www.postgresql.org/docs/16/ (дата обращения: 22.10.2026).</w:t>
       </w:r>
     </w:p>
     <w:p>

</xml_diff>